<commit_message>
fix(relatorio): logos do cabecalho ancorados a pagina; titulo sem prefixo fixo
</commit_message>
<xml_diff>
--- a/public/templates/relatorio-asp-v3.docx
+++ b/public/templates/relatorio-asp-v3.docx
@@ -153,7 +153,7 @@
           <w:szCs w:val="40"/>
           <w:lang w:val="pt-BR"/>
         </w:rPr>
-        <w:t>Relatório</w:t>
+        <w:t xml:space="preserve"/>
       </w:r>
       <w:r>
         <w:rPr>
@@ -164,7 +164,7 @@
           <w:szCs w:val="40"/>
           <w:lang w:val="pt-BR"/>
         </w:rPr>
-        <w:t xml:space="preserve"> </w:t>
+        <w:t xml:space="preserve"/>
       </w:r>
       <w:r>
         <w:rPr>
@@ -175,7 +175,7 @@
           <w:szCs w:val="40"/>
           <w:lang w:val="pt-BR"/>
         </w:rPr>
-        <w:t>de</w:t>
+        <w:t xml:space="preserve"/>
       </w:r>
       <w:r>
         <w:rPr>
@@ -186,7 +186,7 @@
           <w:szCs w:val="40"/>
           <w:lang w:val="pt-BR"/>
         </w:rPr>
-        <w:t xml:space="preserve"> </w:t>
+        <w:t xml:space="preserve"/>
       </w:r>
       <w:r>
         <w:rPr>
@@ -3958,8 +3958,8 @@
       <w:drawing>
         <wp:anchor distT="0" distB="0" distL="114300" distR="114300" simplePos="0" relativeHeight="251658240" behindDoc="0" locked="0" layoutInCell="1" allowOverlap="1" wp14:anchorId="21687086" wp14:editId="4D98B0C3">
           <wp:simplePos x="0" y="0"/>
-          <wp:positionH relativeFrom="column">
-            <wp:posOffset>4643755</wp:posOffset>
+          <wp:positionH relativeFrom="page">
+            <wp:posOffset>5363845</wp:posOffset>
           </wp:positionH>
           <wp:positionV relativeFrom="paragraph">
             <wp:posOffset>-370840</wp:posOffset>
@@ -4026,8 +4026,8 @@
       <w:drawing>
         <wp:anchor distT="0" distB="0" distL="114300" distR="114300" simplePos="0" relativeHeight="251657216" behindDoc="0" locked="0" layoutInCell="1" allowOverlap="1" wp14:anchorId="3EB17DED" wp14:editId="3B6D0D1A">
           <wp:simplePos x="0" y="0"/>
-          <wp:positionH relativeFrom="column">
-            <wp:posOffset>-306705</wp:posOffset>
+          <wp:positionH relativeFrom="page">
+            <wp:posOffset>413385</wp:posOffset>
           </wp:positionH>
           <wp:positionV relativeFrom="paragraph">
             <wp:posOffset>-388620</wp:posOffset>

</xml_diff>